<commit_message>
details updated and correction made
</commit_message>
<xml_diff>
--- a/Authentication_Lab_Notes.docx
+++ b/Authentication_Lab_Notes.docx
@@ -19,15 +19,7 @@
           <w:sz w:val="56"/>
           <w:szCs w:val="56"/>
         </w:rPr>
-        <w:t xml:space="preserve">User </w:t>
-      </w:r>
-      <w:r>
-        <w:rPr>
-          <w:rFonts w:ascii="Arial" w:hAnsi="Arial" w:cs="Arial"/>
-          <w:sz w:val="56"/>
-          <w:szCs w:val="56"/>
-        </w:rPr>
-        <w:t xml:space="preserve">Authentication </w:t>
+        <w:t xml:space="preserve">User Authentication </w:t>
       </w:r>
     </w:p>
     <w:p>
@@ -1315,7 +1307,37 @@
           <w:sz w:val="22"/>
           <w:szCs w:val="24"/>
         </w:rPr>
-        <w:t>Run an Authorization Code flow with PKCE in Postman.</w:t>
+        <w:t xml:space="preserve">Run an Authorization Code flow with </w:t>
+      </w:r>
+      <w:r>
+        <w:t>Proof Key for Code Exchange</w:t>
+      </w:r>
+      <w:r>
+        <w:t xml:space="preserve"> (</w:t>
+      </w:r>
+      <w:r>
+        <w:rPr>
+          <w:rFonts w:cs="Arial"/>
+          <w:sz w:val="22"/>
+          <w:szCs w:val="24"/>
+        </w:rPr>
+        <w:t>PKCE</w:t>
+      </w:r>
+      <w:r>
+        <w:rPr>
+          <w:rFonts w:cs="Arial"/>
+          <w:sz w:val="22"/>
+          <w:szCs w:val="24"/>
+        </w:rPr>
+        <w:t>)</w:t>
+      </w:r>
+      <w:r>
+        <w:rPr>
+          <w:rFonts w:cs="Arial"/>
+          <w:sz w:val="22"/>
+          <w:szCs w:val="24"/>
+        </w:rPr>
+        <w:t xml:space="preserve"> in Postman.</w:t>
       </w:r>
     </w:p>
     <w:p>
@@ -5289,7 +5311,39 @@
           <w:sz w:val="22"/>
           <w:szCs w:val="24"/>
         </w:rPr>
-        <w:t>3.  Explain why the server returns 401 rather than 403.</w:t>
+        <w:t>3.  Explain why the server returns 401</w:t>
+      </w:r>
+      <w:r>
+        <w:rPr>
+          <w:rFonts w:cs="Arial"/>
+          <w:sz w:val="22"/>
+          <w:szCs w:val="24"/>
+        </w:rPr>
+        <w:t>Unauthorized</w:t>
+      </w:r>
+      <w:r>
+        <w:rPr>
+          <w:rFonts w:cs="Arial"/>
+          <w:sz w:val="22"/>
+          <w:szCs w:val="24"/>
+        </w:rPr>
+        <w:t xml:space="preserve"> rather than 403</w:t>
+      </w:r>
+      <w:r>
+        <w:rPr>
+          <w:rFonts w:cs="Arial"/>
+          <w:sz w:val="22"/>
+          <w:szCs w:val="24"/>
+        </w:rPr>
+        <w:t xml:space="preserve"> Forbidden</w:t>
+      </w:r>
+      <w:r>
+        <w:rPr>
+          <w:rFonts w:cs="Arial"/>
+          <w:sz w:val="22"/>
+          <w:szCs w:val="24"/>
+        </w:rPr>
+        <w:t>.</w:t>
       </w:r>
     </w:p>
     <w:p>
@@ -9408,6 +9462,468 @@
     </w:p>
     <w:p>
       <w:pPr>
+        <w:pStyle w:val="Heading2"/>
+        <w:rPr>
+          <w:rFonts w:ascii="Times New Roman" w:hAnsi="Times New Roman"/>
+          <w:sz w:val="28"/>
+          <w:szCs w:val="22"/>
+        </w:rPr>
+      </w:pPr>
+      <w:r>
+        <w:rPr>
+          <w:rFonts w:cs="Arial"/>
+          <w:sz w:val="22"/>
+          <w:szCs w:val="24"/>
+        </w:rPr>
+        <w:t>Inspect the token response fields.</w:t>
+      </w:r>
+      <w:r>
+        <w:rPr>
+          <w:rFonts w:cs="Arial"/>
+          <w:sz w:val="22"/>
+          <w:szCs w:val="24"/>
+        </w:rPr>
+        <w:br/>
+      </w:r>
+      <w:r>
+        <w:rPr>
+          <w:sz w:val="22"/>
+          <w:szCs w:val="22"/>
+        </w:rPr>
+        <w:t>Postman OAuth settings</w:t>
+      </w:r>
+    </w:p>
+    <w:p>
+      <w:pPr>
+        <w:pStyle w:val="NormalWeb"/>
+        <w:rPr>
+          <w:sz w:val="21"/>
+          <w:szCs w:val="21"/>
+        </w:rPr>
+      </w:pPr>
+      <w:r>
+        <w:rPr>
+          <w:sz w:val="21"/>
+          <w:szCs w:val="21"/>
+        </w:rPr>
+        <w:t>Use these values:</w:t>
+      </w:r>
+    </w:p>
+    <w:p>
+      <w:pPr>
+        <w:pStyle w:val="HTMLPreformatted"/>
+        <w:rPr>
+          <w:rStyle w:val="HTMLCode"/>
+          <w:sz w:val="16"/>
+          <w:szCs w:val="16"/>
+        </w:rPr>
+      </w:pPr>
+      <w:r>
+        <w:rPr>
+          <w:rStyle w:val="HTMLCode"/>
+          <w:sz w:val="16"/>
+          <w:szCs w:val="16"/>
+        </w:rPr>
+        <w:t>Grant Type:</w:t>
+      </w:r>
+    </w:p>
+    <w:p>
+      <w:pPr>
+        <w:pStyle w:val="HTMLPreformatted"/>
+        <w:rPr>
+          <w:rStyle w:val="HTMLCode"/>
+          <w:sz w:val="16"/>
+          <w:szCs w:val="16"/>
+        </w:rPr>
+      </w:pPr>
+      <w:r>
+        <w:rPr>
+          <w:rStyle w:val="HTMLCode"/>
+          <w:sz w:val="16"/>
+          <w:szCs w:val="16"/>
+        </w:rPr>
+        <w:t>Authorization Code (With PKCE)</w:t>
+      </w:r>
+    </w:p>
+    <w:p>
+      <w:pPr>
+        <w:pStyle w:val="HTMLPreformatted"/>
+        <w:rPr>
+          <w:rStyle w:val="HTMLCode"/>
+          <w:sz w:val="16"/>
+          <w:szCs w:val="16"/>
+        </w:rPr>
+      </w:pPr>
+    </w:p>
+    <w:p>
+      <w:pPr>
+        <w:pStyle w:val="HTMLPreformatted"/>
+        <w:rPr>
+          <w:rStyle w:val="HTMLCode"/>
+          <w:sz w:val="16"/>
+          <w:szCs w:val="16"/>
+        </w:rPr>
+      </w:pPr>
+      <w:r>
+        <w:rPr>
+          <w:rStyle w:val="HTMLCode"/>
+          <w:sz w:val="16"/>
+          <w:szCs w:val="16"/>
+        </w:rPr>
+        <w:t>Callback URL:</w:t>
+      </w:r>
+    </w:p>
+    <w:p>
+      <w:pPr>
+        <w:pStyle w:val="HTMLPreformatted"/>
+        <w:rPr>
+          <w:rStyle w:val="HTMLCode"/>
+          <w:sz w:val="16"/>
+          <w:szCs w:val="16"/>
+        </w:rPr>
+      </w:pPr>
+      <w:r>
+        <w:rPr>
+          <w:rStyle w:val="HTMLCode"/>
+          <w:sz w:val="16"/>
+          <w:szCs w:val="16"/>
+        </w:rPr>
+        <w:t>https://oauth.pstmn.io/v1/browser-callback</w:t>
+      </w:r>
+    </w:p>
+    <w:p>
+      <w:pPr>
+        <w:pStyle w:val="HTMLPreformatted"/>
+        <w:rPr>
+          <w:rStyle w:val="HTMLCode"/>
+          <w:sz w:val="16"/>
+          <w:szCs w:val="16"/>
+        </w:rPr>
+      </w:pPr>
+    </w:p>
+    <w:p>
+      <w:pPr>
+        <w:pStyle w:val="HTMLPreformatted"/>
+        <w:rPr>
+          <w:rStyle w:val="HTMLCode"/>
+          <w:sz w:val="16"/>
+          <w:szCs w:val="16"/>
+        </w:rPr>
+      </w:pPr>
+      <w:r>
+        <w:rPr>
+          <w:rStyle w:val="HTMLCode"/>
+          <w:sz w:val="16"/>
+          <w:szCs w:val="16"/>
+        </w:rPr>
+        <w:t>Auth URL:</w:t>
+      </w:r>
+    </w:p>
+    <w:p>
+      <w:pPr>
+        <w:pStyle w:val="HTMLPreformatted"/>
+        <w:rPr>
+          <w:rStyle w:val="HTMLCode"/>
+          <w:sz w:val="16"/>
+          <w:szCs w:val="16"/>
+        </w:rPr>
+      </w:pPr>
+      <w:r>
+        <w:rPr>
+          <w:rStyle w:val="HTMLCode"/>
+          <w:sz w:val="16"/>
+          <w:szCs w:val="16"/>
+        </w:rPr>
+        <w:t>http://localhost:8080/realms/auth-lab/protocol/openid-connect/auth</w:t>
+      </w:r>
+    </w:p>
+    <w:p>
+      <w:pPr>
+        <w:pStyle w:val="HTMLPreformatted"/>
+        <w:rPr>
+          <w:rStyle w:val="HTMLCode"/>
+          <w:sz w:val="16"/>
+          <w:szCs w:val="16"/>
+        </w:rPr>
+      </w:pPr>
+    </w:p>
+    <w:p>
+      <w:pPr>
+        <w:pStyle w:val="HTMLPreformatted"/>
+        <w:rPr>
+          <w:rStyle w:val="HTMLCode"/>
+          <w:sz w:val="16"/>
+          <w:szCs w:val="16"/>
+        </w:rPr>
+      </w:pPr>
+      <w:r>
+        <w:rPr>
+          <w:rStyle w:val="HTMLCode"/>
+          <w:sz w:val="16"/>
+          <w:szCs w:val="16"/>
+        </w:rPr>
+        <w:t>Access Token URL:</w:t>
+      </w:r>
+    </w:p>
+    <w:p>
+      <w:pPr>
+        <w:pStyle w:val="HTMLPreformatted"/>
+        <w:rPr>
+          <w:rStyle w:val="HTMLCode"/>
+          <w:sz w:val="16"/>
+          <w:szCs w:val="16"/>
+        </w:rPr>
+      </w:pPr>
+      <w:r>
+        <w:rPr>
+          <w:rStyle w:val="HTMLCode"/>
+          <w:sz w:val="16"/>
+          <w:szCs w:val="16"/>
+        </w:rPr>
+        <w:t>http://localhost:8080/realms/auth-lab/protocol/openid-connect/token</w:t>
+      </w:r>
+    </w:p>
+    <w:p>
+      <w:pPr>
+        <w:pStyle w:val="HTMLPreformatted"/>
+        <w:rPr>
+          <w:rStyle w:val="HTMLCode"/>
+          <w:sz w:val="16"/>
+          <w:szCs w:val="16"/>
+        </w:rPr>
+      </w:pPr>
+    </w:p>
+    <w:p>
+      <w:pPr>
+        <w:pStyle w:val="HTMLPreformatted"/>
+        <w:rPr>
+          <w:rStyle w:val="HTMLCode"/>
+          <w:sz w:val="16"/>
+          <w:szCs w:val="16"/>
+        </w:rPr>
+      </w:pPr>
+      <w:r>
+        <w:rPr>
+          <w:rStyle w:val="HTMLCode"/>
+          <w:sz w:val="16"/>
+          <w:szCs w:val="16"/>
+        </w:rPr>
+        <w:t>Client ID:</w:t>
+      </w:r>
+    </w:p>
+    <w:p>
+      <w:pPr>
+        <w:pStyle w:val="HTMLPreformatted"/>
+        <w:rPr>
+          <w:rStyle w:val="HTMLCode"/>
+          <w:sz w:val="16"/>
+          <w:szCs w:val="16"/>
+        </w:rPr>
+      </w:pPr>
+      <w:r>
+        <w:rPr>
+          <w:rStyle w:val="HTMLCode"/>
+          <w:sz w:val="16"/>
+          <w:szCs w:val="16"/>
+        </w:rPr>
+        <w:t>postman-client</w:t>
+      </w:r>
+    </w:p>
+    <w:p>
+      <w:pPr>
+        <w:pStyle w:val="HTMLPreformatted"/>
+        <w:rPr>
+          <w:rStyle w:val="HTMLCode"/>
+          <w:sz w:val="16"/>
+          <w:szCs w:val="16"/>
+        </w:rPr>
+      </w:pPr>
+    </w:p>
+    <w:p>
+      <w:pPr>
+        <w:pStyle w:val="HTMLPreformatted"/>
+        <w:rPr>
+          <w:rStyle w:val="HTMLCode"/>
+          <w:sz w:val="16"/>
+          <w:szCs w:val="16"/>
+        </w:rPr>
+      </w:pPr>
+      <w:r>
+        <w:rPr>
+          <w:rStyle w:val="HTMLCode"/>
+          <w:sz w:val="16"/>
+          <w:szCs w:val="16"/>
+        </w:rPr>
+        <w:t>Client Secret:</w:t>
+      </w:r>
+    </w:p>
+    <w:p>
+      <w:pPr>
+        <w:pStyle w:val="HTMLPreformatted"/>
+        <w:rPr>
+          <w:rStyle w:val="HTMLCode"/>
+          <w:sz w:val="16"/>
+          <w:szCs w:val="16"/>
+        </w:rPr>
+      </w:pPr>
+      <w:r>
+        <w:rPr>
+          <w:rStyle w:val="HTMLCode"/>
+          <w:sz w:val="16"/>
+          <w:szCs w:val="16"/>
+        </w:rPr>
+        <w:t>Leave blank</w:t>
+      </w:r>
+    </w:p>
+    <w:p>
+      <w:pPr>
+        <w:pStyle w:val="HTMLPreformatted"/>
+        <w:rPr>
+          <w:rStyle w:val="HTMLCode"/>
+          <w:sz w:val="16"/>
+          <w:szCs w:val="16"/>
+        </w:rPr>
+      </w:pPr>
+    </w:p>
+    <w:p>
+      <w:pPr>
+        <w:pStyle w:val="HTMLPreformatted"/>
+        <w:rPr>
+          <w:rStyle w:val="HTMLCode"/>
+          <w:sz w:val="16"/>
+          <w:szCs w:val="16"/>
+        </w:rPr>
+      </w:pPr>
+      <w:r>
+        <w:rPr>
+          <w:rStyle w:val="HTMLCode"/>
+          <w:sz w:val="16"/>
+          <w:szCs w:val="16"/>
+        </w:rPr>
+        <w:t>Scope:</w:t>
+      </w:r>
+    </w:p>
+    <w:p>
+      <w:pPr>
+        <w:pStyle w:val="HTMLPreformatted"/>
+        <w:rPr>
+          <w:rStyle w:val="HTMLCode"/>
+          <w:sz w:val="16"/>
+          <w:szCs w:val="16"/>
+        </w:rPr>
+      </w:pPr>
+      <w:proofErr w:type="spellStart"/>
+      <w:r>
+        <w:rPr>
+          <w:rStyle w:val="HTMLCode"/>
+          <w:sz w:val="16"/>
+          <w:szCs w:val="16"/>
+        </w:rPr>
+        <w:t>openid</w:t>
+      </w:r>
+      <w:proofErr w:type="spellEnd"/>
+      <w:r>
+        <w:rPr>
+          <w:rStyle w:val="HTMLCode"/>
+          <w:sz w:val="16"/>
+          <w:szCs w:val="16"/>
+        </w:rPr>
+        <w:t xml:space="preserve"> profile email roles</w:t>
+      </w:r>
+    </w:p>
+    <w:p>
+      <w:pPr>
+        <w:pStyle w:val="HTMLPreformatted"/>
+        <w:rPr>
+          <w:rStyle w:val="HTMLCode"/>
+          <w:sz w:val="16"/>
+          <w:szCs w:val="16"/>
+        </w:rPr>
+      </w:pPr>
+    </w:p>
+    <w:p>
+      <w:pPr>
+        <w:pStyle w:val="HTMLPreformatted"/>
+        <w:rPr>
+          <w:rStyle w:val="HTMLCode"/>
+          <w:sz w:val="16"/>
+          <w:szCs w:val="16"/>
+        </w:rPr>
+      </w:pPr>
+      <w:r>
+        <w:rPr>
+          <w:rStyle w:val="HTMLCode"/>
+          <w:sz w:val="16"/>
+          <w:szCs w:val="16"/>
+        </w:rPr>
+        <w:t>Code Challenge Method:</w:t>
+      </w:r>
+    </w:p>
+    <w:p>
+      <w:pPr>
+        <w:pStyle w:val="HTMLPreformatted"/>
+        <w:rPr>
+          <w:rStyle w:val="HTMLCode"/>
+          <w:sz w:val="16"/>
+          <w:szCs w:val="16"/>
+        </w:rPr>
+      </w:pPr>
+      <w:r>
+        <w:rPr>
+          <w:rStyle w:val="HTMLCode"/>
+          <w:sz w:val="16"/>
+          <w:szCs w:val="16"/>
+        </w:rPr>
+        <w:t>SHA-256</w:t>
+      </w:r>
+    </w:p>
+    <w:p>
+      <w:pPr>
+        <w:pStyle w:val="HTMLPreformatted"/>
+        <w:rPr>
+          <w:rStyle w:val="HTMLCode"/>
+          <w:sz w:val="16"/>
+          <w:szCs w:val="16"/>
+        </w:rPr>
+      </w:pPr>
+    </w:p>
+    <w:p>
+      <w:pPr>
+        <w:pStyle w:val="HTMLPreformatted"/>
+        <w:rPr>
+          <w:rStyle w:val="HTMLCode"/>
+          <w:sz w:val="16"/>
+          <w:szCs w:val="16"/>
+        </w:rPr>
+      </w:pPr>
+      <w:r>
+        <w:rPr>
+          <w:rStyle w:val="HTMLCode"/>
+          <w:sz w:val="16"/>
+          <w:szCs w:val="16"/>
+        </w:rPr>
+        <w:t>Authorize using browser:</w:t>
+      </w:r>
+    </w:p>
+    <w:p>
+      <w:pPr>
+        <w:pStyle w:val="HTMLPreformatted"/>
+        <w:rPr>
+          <w:sz w:val="16"/>
+          <w:szCs w:val="16"/>
+        </w:rPr>
+      </w:pPr>
+      <w:r>
+        <w:rPr>
+          <w:rStyle w:val="HTMLCode"/>
+          <w:sz w:val="16"/>
+          <w:szCs w:val="16"/>
+        </w:rPr>
+        <w:t>Enabled</w:t>
+      </w:r>
+    </w:p>
+    <w:p>
+      <w:pPr>
         <w:spacing w:after="60"/>
         <w:ind w:left="403" w:hanging="346"/>
         <w:rPr>
@@ -9416,14 +9932,6 @@
           <w:szCs w:val="24"/>
         </w:rPr>
       </w:pPr>
-      <w:r>
-        <w:rPr>
-          <w:rFonts w:cs="Arial"/>
-          <w:sz w:val="22"/>
-          <w:szCs w:val="24"/>
-        </w:rPr>
-        <w:t>9.  Inspect the token response fields.</w:t>
-      </w:r>
     </w:p>
     <w:p>
       <w:pPr>
@@ -11229,14 +11737,7 @@
         <w:color w:val="5B6773"/>
         <w:sz w:val="17"/>
       </w:rPr>
-      <w:t>User Authentication</w:t>
-    </w:r>
-    <w:r>
-      <w:rPr>
-        <w:color w:val="5B6773"/>
-        <w:sz w:val="17"/>
-      </w:rPr>
-      <w:t xml:space="preserve"> </w:t>
+      <w:t xml:space="preserve">User Authentication </w:t>
     </w:r>
     <w:proofErr w:type="gramStart"/>
     <w:r>
@@ -12284,6 +12785,7 @@
   <w:style w:type="character" w:default="1" w:styleId="DefaultParagraphFont">
     <w:name w:val="Default Paragraph Font"/>
     <w:uiPriority w:val="1"/>
+    <w:semiHidden/>
     <w:unhideWhenUsed/>
   </w:style>
   <w:style w:type="table" w:default="1" w:styleId="TableNormal">
@@ -23066,6 +23568,83 @@
       <w:sz w:val="16"/>
     </w:rPr>
   </w:style>
+  <w:style w:type="paragraph" w:styleId="NormalWeb">
+    <w:name w:val="Normal (Web)"/>
+    <w:basedOn w:val="Normal"/>
+    <w:uiPriority w:val="99"/>
+    <w:semiHidden/>
+    <w:unhideWhenUsed/>
+    <w:rsid w:val="00F3476A"/>
+    <w:pPr>
+      <w:spacing w:before="100" w:beforeAutospacing="1" w:after="100" w:afterAutospacing="1" w:line="240" w:lineRule="auto"/>
+    </w:pPr>
+    <w:rPr>
+      <w:rFonts w:ascii="Times New Roman" w:eastAsia="Times New Roman" w:hAnsi="Times New Roman" w:cs="Times New Roman"/>
+      <w:sz w:val="24"/>
+      <w:szCs w:val="24"/>
+    </w:rPr>
+  </w:style>
+  <w:style w:type="paragraph" w:styleId="HTMLPreformatted">
+    <w:name w:val="HTML Preformatted"/>
+    <w:basedOn w:val="Normal"/>
+    <w:link w:val="HTMLPreformattedChar"/>
+    <w:uiPriority w:val="99"/>
+    <w:semiHidden/>
+    <w:unhideWhenUsed/>
+    <w:rsid w:val="00F3476A"/>
+    <w:pPr>
+      <w:tabs>
+        <w:tab w:val="left" w:pos="916"/>
+        <w:tab w:val="left" w:pos="1832"/>
+        <w:tab w:val="left" w:pos="2748"/>
+        <w:tab w:val="left" w:pos="3664"/>
+        <w:tab w:val="left" w:pos="4580"/>
+        <w:tab w:val="left" w:pos="5496"/>
+        <w:tab w:val="left" w:pos="6412"/>
+        <w:tab w:val="left" w:pos="7328"/>
+        <w:tab w:val="left" w:pos="8244"/>
+        <w:tab w:val="left" w:pos="9160"/>
+        <w:tab w:val="left" w:pos="10076"/>
+        <w:tab w:val="left" w:pos="10992"/>
+        <w:tab w:val="left" w:pos="11908"/>
+        <w:tab w:val="left" w:pos="12824"/>
+        <w:tab w:val="left" w:pos="13740"/>
+        <w:tab w:val="left" w:pos="14656"/>
+      </w:tabs>
+      <w:spacing w:after="0" w:line="240" w:lineRule="auto"/>
+    </w:pPr>
+    <w:rPr>
+      <w:rFonts w:ascii="Courier New" w:eastAsia="Times New Roman" w:hAnsi="Courier New" w:cs="Courier New"/>
+      <w:sz w:val="20"/>
+      <w:szCs w:val="20"/>
+    </w:rPr>
+  </w:style>
+  <w:style w:type="character" w:customStyle="1" w:styleId="HTMLPreformattedChar">
+    <w:name w:val="HTML Preformatted Char"/>
+    <w:basedOn w:val="DefaultParagraphFont"/>
+    <w:link w:val="HTMLPreformatted"/>
+    <w:uiPriority w:val="99"/>
+    <w:semiHidden/>
+    <w:rsid w:val="00F3476A"/>
+    <w:rPr>
+      <w:rFonts w:ascii="Courier New" w:eastAsia="Times New Roman" w:hAnsi="Courier New" w:cs="Courier New"/>
+      <w:sz w:val="20"/>
+      <w:szCs w:val="20"/>
+    </w:rPr>
+  </w:style>
+  <w:style w:type="character" w:styleId="HTMLCode">
+    <w:name w:val="HTML Code"/>
+    <w:basedOn w:val="DefaultParagraphFont"/>
+    <w:uiPriority w:val="99"/>
+    <w:semiHidden/>
+    <w:unhideWhenUsed/>
+    <w:rsid w:val="00F3476A"/>
+    <w:rPr>
+      <w:rFonts w:ascii="Courier New" w:eastAsia="Times New Roman" w:hAnsi="Courier New" w:cs="Courier New"/>
+      <w:sz w:val="20"/>
+      <w:szCs w:val="20"/>
+    </w:rPr>
+  </w:style>
 </w:styles>
 </file>
 

</xml_diff>